<commit_message>
Convert 7 .doc template files to .docx via Word COM
Adds convert_doc_templates.py (convert_one/convert_all) and its TDD
test, then runs the real one-time migration: each source .doc is
opened with Word COM, saved as .docx (WD_FORMAT_DOCX), and the table
count is verified to match before/after. All 7 conversions matched.

Original .doc files are untouched; the new .docx siblings become
fixtures for later Excel/Word automation tasks.
</commit_message>
<xml_diff>
--- a/03. CV mời chuyên gia - mẫu COLOSTRUM/CV mời chuyên gia.docx
+++ b/03. CV mời chuyên gia - mẫu COLOSTRUM/CV mời chuyên gia.docx
@@ -3013,43 +3013,43 @@
       </w:pPr>
     </w:lvl>
   </w:abstractNum>
-  <w:num w:numId="1" w16cid:durableId="544173668">
+  <w:num w:numId="1" w16cid:durableId="2007785346">
     <w:abstractNumId w:val="7"/>
   </w:num>
-  <w:num w:numId="2" w16cid:durableId="1016464679">
+  <w:num w:numId="2" w16cid:durableId="1389260162">
     <w:abstractNumId w:val="9"/>
   </w:num>
-  <w:num w:numId="3" w16cid:durableId="1374620570">
+  <w:num w:numId="3" w16cid:durableId="1923951229">
     <w:abstractNumId w:val="2"/>
   </w:num>
-  <w:num w:numId="4" w16cid:durableId="1084454955">
+  <w:num w:numId="4" w16cid:durableId="1210843222">
     <w:abstractNumId w:val="6"/>
   </w:num>
-  <w:num w:numId="5" w16cid:durableId="1826971934">
+  <w:num w:numId="5" w16cid:durableId="53630492">
     <w:abstractNumId w:val="11"/>
   </w:num>
-  <w:num w:numId="6" w16cid:durableId="438837889">
+  <w:num w:numId="6" w16cid:durableId="853571624">
     <w:abstractNumId w:val="8"/>
   </w:num>
-  <w:num w:numId="7" w16cid:durableId="1775518923">
+  <w:num w:numId="7" w16cid:durableId="1518736293">
     <w:abstractNumId w:val="4"/>
   </w:num>
-  <w:num w:numId="8" w16cid:durableId="1703284202">
+  <w:num w:numId="8" w16cid:durableId="1222598295">
     <w:abstractNumId w:val="5"/>
   </w:num>
-  <w:num w:numId="9" w16cid:durableId="1787650279">
+  <w:num w:numId="9" w16cid:durableId="426927380">
     <w:abstractNumId w:val="1"/>
   </w:num>
-  <w:num w:numId="10" w16cid:durableId="1419862103">
+  <w:num w:numId="10" w16cid:durableId="2141412432">
     <w:abstractNumId w:val="3"/>
   </w:num>
-  <w:num w:numId="11" w16cid:durableId="728462647">
+  <w:num w:numId="11" w16cid:durableId="1066412299">
     <w:abstractNumId w:val="0"/>
   </w:num>
-  <w:num w:numId="12" w16cid:durableId="37753401">
+  <w:num w:numId="12" w16cid:durableId="908423172">
     <w:abstractNumId w:val="10"/>
   </w:num>
-  <w:num w:numId="13" w16cid:durableId="1161115543">
+  <w:num w:numId="13" w16cid:durableId="393311407">
     <w:abstractNumId w:val="10"/>
     <w:lvlOverride w:ilvl="0"/>
     <w:lvlOverride w:ilvl="1"/>
@@ -3070,7 +3070,7 @@
     <w:rPrDefault>
       <w:rPr>
         <w:rFonts w:ascii="Arial" w:eastAsia="MS Mincho" w:hAnsi="Arial" w:cs="Times New Roman"/>
-        <w:lang w:val="vi-VN" w:eastAsia="zh-CN" w:bidi="ar-SA"/>
+        <w:lang w:val="en-US" w:eastAsia="en-US" w:bidi="ar-SA"/>
       </w:rPr>
     </w:rPrDefault>
     <w:pPrDefault/>
@@ -3463,7 +3463,6 @@
     <w:rPr>
       <w:sz w:val="22"/>
       <w:szCs w:val="22"/>
-      <w:lang w:val="en-US" w:eastAsia="en-US"/>
     </w:rPr>
   </w:style>
   <w:style w:type="character" w:default="1" w:styleId="DefaultParagraphFont">
@@ -3500,7 +3499,6 @@
     <w:rPr>
       <w:sz w:val="22"/>
       <w:szCs w:val="22"/>
-      <w:lang w:val="en-US" w:eastAsia="en-US"/>
     </w:rPr>
   </w:style>
   <w:style w:type="table" w:styleId="TableGrid">
@@ -3573,39 +3571,39 @@
         <a:sysClr val="window" lastClr="FFFFFF"/>
       </a:lt1>
       <a:dk2>
-        <a:srgbClr val="0E2841"/>
+        <a:srgbClr val="44546A"/>
       </a:dk2>
       <a:lt2>
-        <a:srgbClr val="E8E8E8"/>
+        <a:srgbClr val="E7E6E6"/>
       </a:lt2>
       <a:accent1>
-        <a:srgbClr val="156082"/>
+        <a:srgbClr val="4472C4"/>
       </a:accent1>
       <a:accent2>
-        <a:srgbClr val="E97132"/>
+        <a:srgbClr val="ED7D31"/>
       </a:accent2>
       <a:accent3>
-        <a:srgbClr val="196B24"/>
+        <a:srgbClr val="A5A5A5"/>
       </a:accent3>
       <a:accent4>
-        <a:srgbClr val="0F9ED5"/>
+        <a:srgbClr val="FFC000"/>
       </a:accent4>
       <a:accent5>
-        <a:srgbClr val="A02B93"/>
+        <a:srgbClr val="5B9BD5"/>
       </a:accent5>
       <a:accent6>
-        <a:srgbClr val="4EA72E"/>
+        <a:srgbClr val="70AD47"/>
       </a:accent6>
       <a:hlink>
-        <a:srgbClr val="467886"/>
+        <a:srgbClr val="0563C1"/>
       </a:hlink>
       <a:folHlink>
-        <a:srgbClr val="96607D"/>
+        <a:srgbClr val="954F72"/>
       </a:folHlink>
     </a:clrScheme>
     <a:fontScheme name="Office">
       <a:majorFont>
-        <a:latin typeface="Aptos Display" panose="02110004020202020204"/>
+        <a:latin typeface="Calibri Light" panose="020F0302020204030204"/>
         <a:ea typeface=""/>
         <a:cs typeface=""/>
         <a:font script="Jpan" typeface="游ゴシック Light"/>
@@ -3657,7 +3655,7 @@
         <a:font script="Tfng" typeface="Ebrima"/>
       </a:majorFont>
       <a:minorFont>
-        <a:latin typeface="Aptos" panose="02110004020202020204"/>
+        <a:latin typeface="Calibri" panose="020F0502020204030204"/>
         <a:ea typeface=""/>
         <a:cs typeface=""/>
         <a:font script="Jpan" typeface="游明朝"/>
@@ -3768,6 +3766,13 @@
         </a:gradFill>
       </a:fillStyleLst>
       <a:lnStyleLst>
+        <a:ln w="6350" cap="flat" cmpd="sng" algn="ctr">
+          <a:solidFill>
+            <a:schemeClr val="phClr"/>
+          </a:solidFill>
+          <a:prstDash val="solid"/>
+          <a:miter lim="800000"/>
+        </a:ln>
         <a:ln w="12700" cap="flat" cmpd="sng" algn="ctr">
           <a:solidFill>
             <a:schemeClr val="phClr"/>
@@ -3776,13 +3781,6 @@
           <a:miter lim="800000"/>
         </a:ln>
         <a:ln w="19050" cap="flat" cmpd="sng" algn="ctr">
-          <a:solidFill>
-            <a:schemeClr val="phClr"/>
-          </a:solidFill>
-          <a:prstDash val="solid"/>
-          <a:miter lim="800000"/>
-        </a:ln>
-        <a:ln w="25400" cap="flat" cmpd="sng" algn="ctr">
           <a:solidFill>
             <a:schemeClr val="phClr"/>
           </a:solidFill>
@@ -3847,31 +3845,11 @@
       </a:bgFillStyleLst>
     </a:fmtScheme>
   </a:themeElements>
-  <a:objectDefaults>
-    <a:lnDef>
-      <a:spPr/>
-      <a:bodyPr/>
-      <a:lstStyle/>
-      <a:style>
-        <a:lnRef idx="2">
-          <a:schemeClr val="accent1"/>
-        </a:lnRef>
-        <a:fillRef idx="0">
-          <a:schemeClr val="accent1"/>
-        </a:fillRef>
-        <a:effectRef idx="1">
-          <a:schemeClr val="accent1"/>
-        </a:effectRef>
-        <a:fontRef idx="minor">
-          <a:schemeClr val="tx1"/>
-        </a:fontRef>
-      </a:style>
-    </a:lnDef>
-  </a:objectDefaults>
+  <a:objectDefaults/>
   <a:extraClrSchemeLst/>
   <a:extLst>
     <a:ext uri="{05A4C25C-085E-4340-85A3-A5531E510DB2}">
-      <thm15:themeFamily xmlns:thm15="http://schemas.microsoft.com/office/thememl/2012/main" name="Office Theme" id="{2E142A2C-CD16-42D6-873A-C26D2A0506FA}" vid="{1BDDFF52-6CD6-40A5-AB3C-68EB2F1E4D0A}"/>
+      <thm15:themeFamily xmlns:thm15="http://schemas.microsoft.com/office/thememl/2012/main" name="Office Theme" id="{62F939B6-93AF-4DB8-9C6B-D6C7DFDC589F}" vid="{4A3C46E8-61CC-4603-A589-7422A47A8E4A}"/>
     </a:ext>
   </a:extLst>
 </a:theme>

</xml_diff>